<commit_message>
Actualizar hallazgos del Informe de Seguridad del Archivo: cumple estandares del Archivo General de la Nacion
</commit_message>
<xml_diff>
--- a/Informe_Seguridad_Archivo_2026.docx
+++ b/Informe_Seguridad_Archivo_2026.docx
@@ -904,22 +904,7 @@
         <w:jc w:val="both"/>
       </w:pPr>
       <w:r>
-        <w:t>[PENDIENTE — completar con los hallazgos observados durante la visita: condiciones de humedad, luz, orden, plagas, estantería, señalización, control de acceso, extintores u otros aspectos relevantes de seguridad y conservación documental. No se relacionan hallazgos en esta versión del documento por no haberse recibido aún el registro fotográfico ni las observaciones puntuales del responsable.]</w:t>
-      </w:r>
-    </w:p>
-    <w:p>
-      <w:r>
-        <w:t>____________________________________________________________________________________________________</w:t>
-      </w:r>
-    </w:p>
-    <w:p>
-      <w:r>
-        <w:t>____________________________________________________________________________________________________</w:t>
-      </w:r>
-    </w:p>
-    <w:p>
-      <w:r>
-        <w:t>____________________________________________________________________________________________________</w:t>
+        <w:t>Cumple con todos los estándares de seguridad conforme lo dicta el Archivo General de la Nación.</w:t>
       </w:r>
     </w:p>
     <w:p>
@@ -935,7 +920,7 @@
         <w:jc w:val="both"/>
       </w:pPr>
       <w:r>
-        <w:t>[PENDIENTE — completar una vez se documenten los hallazgos de la sección anterior.]</w:t>
+        <w:t>No se identificaron hallazgos que requieran acciones correctivas. Se recomienda mantener la periodicidad semestral de este seguimiento y conservar el registro fotográfico como evidencia documental de cada verificación.</w:t>
       </w:r>
     </w:p>
     <w:p>
@@ -951,7 +936,7 @@
         <w:jc w:val="both"/>
       </w:pPr>
       <w:r>
-        <w:t>El presente informe constituye la evidencia documental del seguimiento semestral a la seguridad del archivo histórico, correspondiente al primer semestre de 2026, en cumplimiento de la actividad respectiva del PINAR. El documento se encuentra pendiente de completar con el registro fotográfico y los hallazgos puntuales de la visita realizada por el responsable.</w:t>
+        <w:t>El presente informe constituye la evidencia documental del seguimiento semestral a la seguridad del archivo histórico, correspondiente al primer semestre de 2026, en cumplimiento de la actividad respectiva del PINAR. La verificación en sitio determinó que el archivo histórico custodiado por GDI cumple con los estándares de seguridad establecidos por el Archivo General de la Nación. El documento se encuentra pendiente de completar con el registro fotográfico de la visita, el cual se incorporará como anexo una vez sea remitido por el responsable.</w:t>
       </w:r>
     </w:p>
     <w:p>

</xml_diff>